<commit_message>
feat(manuscripts): add synthesizing conclusion paragraph to Chapter II (v4.33)
- Added brief, concise, non-repetitive conclusion paragraph to Chapter II Literature Review across ChpII v3.docx (4,218 words), chp2-litreview.md (4,309 words), and manuscripts-only/chp2-litreview.md (3,961 words)
- Synthesizes the five reviewed theoretical domains: queuing dynamics & Kingman formula (Ca^2) vs static volume, single-paradigm limitations (schedules, DES, unconstrained ML), two-stage hybrid predictive modeling, and the operational evaluation triad (Robustness, Resilience, Generalizability) motivating Chapter III
- Preserved 100% census of all 101 peer-reviewed literature citations
- Updated results/00_VERSION_CONTROL_AND_PROVENANCE.md to v4.33; 39/39 tests pass
</commit_message>
<xml_diff>
--- a/thesis_docs/manuscripts/ChpII v3.docx
+++ b/thesis_docs/manuscripts/ChpII v3.docx
@@ -1623,6 +1623,20 @@
         <w:t>Crucially, this three-dimensional evaluation framework reveals inherent operational trade-offs (H1): no single forecasting paradigm universally dominates all three operational dimensions (Hopfe et al., 2024). A model engineered to maximize routine accuracy (Robustness) may collapse during severe weather shocks (Resilience), while a complex architecture tuned to absorb disruption may overfit to local terminal geometry and fail zero-shot spatial deployment (Generalizability). By formalizing these three pillars, this research establishes an objective, domain-grounded evaluation methodology that bridges the gap between theoretical data science and defensible TSA security checkpoint management, providing the direct theoretical handoff to the 4-tier filtering pipeline, the 3-model candidate evaluation suite, and the empirical benchmarks in Chapters III, IV, and V.</w:t>
       </w:r>
     </w:p>
+    <w:p>
+      <w:pPr>
+        <w:spacing w:before="0" w:after="0" w:line="480" w:lineRule="auto"/>
+        <w:ind w:firstLine="720"/>
+        <w:jc w:val="left"/>
+      </w:pPr>
+      <w:r>
+        <w:rPr>
+          <w:rFonts w:ascii="Times New Roman" w:hAnsi="Times New Roman"/>
+          <w:sz w:val="24"/>
+        </w:rPr>
+        <w:t>In summary, this literature review establishes that modeling airport security checkpoint passenger flow requires moving beyond static, volume-centric assumptions toward dynamic, volatility-informed paradigms. Commercial air terminals operate as tightly coupled queuing networks where flight bank clustering, connecting passenger flows, and severe convective weather induce acute arrival burstiness that scales queue delays quadratically under Kingman's principles (Ca^2). The literature demonstrates that isolated analytical approaches are insufficient: deterministic schedules cannot adapt to tactical delay cascades, micro-simulations demand prohibitive calibration overhead, and unconstrained machine learning models fall victim to the Empty Checkpoint Fallacy during severe operational shocks. Conversely, hybrid predictive frameworks that couple deterministic flight schedule baselines with machine learning residual adjustments and recursive error feedback synthesize the structural stability of schedule dynamics with the empirical flexibility of data-driven learning. Evaluating these candidate architectures across the operational triad of nominal robustness, disruption resilience, and zero-shot generalizability provides the theoretical foundation for the empirical methodology and experimental design formulated in Chapter III.</w:t>
+      </w:r>
+    </w:p>
     <w:sectPr>
       <w:pgSz w:w="12240" w:h="15840"/>
       <w:pgMar w:top="1440" w:right="1440" w:bottom="1440" w:left="1440" w:header="720" w:footer="720" w:gutter="0"/>

</xml_diff>